<commit_message>
correção de persona e requesitos
</commit_message>
<xml_diff>
--- a/AnaliseRequesitos/2025140801_hugp/Roles e Requisitos do SI Hugo.docx
+++ b/AnaliseRequesitos/2025140801_hugp/Roles e Requisitos do SI Hugo.docx
@@ -10,6 +10,15 @@
         </w:rPr>
       </w:pPr>
       <w:bookmarkStart w:id="0" w:name="_Toc83646918"/>
+      <w:r>
+        <w:rPr>
+          <w:b/>
+          <w:i/>
+          <w:iCs/>
+          <w:lang w:val="pt-PT"/>
+        </w:rPr>
+        <w:t xml:space="preserve"> </w:t>
+      </w:r>
       <w:r>
         <w:rPr>
           <w:b/>
@@ -365,7 +374,19 @@
               <w:rPr>
                 <w:lang w:val="pt-PT"/>
               </w:rPr>
-              <w:t>Utilizador de parceria onde pode ajudar, doar ou fazer vários serviços</w:t>
+              <w:t>Utilizador</w:t>
+            </w:r>
+            <w:r>
+              <w:rPr>
+                <w:lang w:val="pt-PT"/>
+              </w:rPr>
+              <w:t xml:space="preserve"> autenticado</w:t>
+            </w:r>
+            <w:r>
+              <w:rPr>
+                <w:lang w:val="pt-PT"/>
+              </w:rPr>
+              <w:t xml:space="preserve"> de parceria onde pode ajudar, doar ou fazer vários serviços</w:t>
             </w:r>
             <w:r>
               <w:rPr>
@@ -469,6 +490,14 @@
             </w:r>
             <w:proofErr w:type="spellStart"/>
             <w:r>
+              <w:t>autenticado</w:t>
+            </w:r>
+            <w:proofErr w:type="spellEnd"/>
+            <w:r>
+              <w:t xml:space="preserve"> </w:t>
+            </w:r>
+            <w:proofErr w:type="spellStart"/>
+            <w:r>
               <w:t>marcado</w:t>
             </w:r>
             <w:proofErr w:type="spellEnd"/>
@@ -753,7 +782,19 @@
               <w:rPr>
                 <w:lang w:val="pt-PT"/>
               </w:rPr>
-              <w:t xml:space="preserve">Utilizador </w:t>
+              <w:t>Utilizador</w:t>
+            </w:r>
+            <w:r>
+              <w:rPr>
+                <w:lang w:val="pt-PT"/>
+              </w:rPr>
+              <w:t xml:space="preserve"> autenticado</w:t>
+            </w:r>
+            <w:r>
+              <w:rPr>
+                <w:lang w:val="pt-PT"/>
+              </w:rPr>
+              <w:t xml:space="preserve"> </w:t>
             </w:r>
             <w:r>
               <w:rPr>
@@ -1617,6 +1658,7 @@
               <w:rPr>
                 <w:lang w:val="pt-PT"/>
               </w:rPr>
+              <w:lastRenderedPageBreak/>
               <w:t>RF-BO-01</w:t>
             </w:r>
           </w:p>
@@ -1719,7 +1761,6 @@
               <w:rPr>
                 <w:lang w:val="pt-PT"/>
               </w:rPr>
-              <w:lastRenderedPageBreak/>
               <w:t>RF-BO-02</w:t>
             </w:r>
           </w:p>
@@ -3528,6 +3569,7 @@
               <w:rPr>
                 <w:lang w:val="pt-PT"/>
               </w:rPr>
+              <w:lastRenderedPageBreak/>
               <w:t>02</w:t>
             </w:r>
           </w:p>
@@ -3543,6 +3585,7 @@
             </w:pPr>
             <w:proofErr w:type="spellStart"/>
             <w:r>
+              <w:lastRenderedPageBreak/>
               <w:t>Criar</w:t>
             </w:r>
             <w:proofErr w:type="spellEnd"/>
@@ -3696,7 +3739,6 @@
               <w:rPr>
                 <w:lang w:val="pt-PT"/>
               </w:rPr>
-              <w:lastRenderedPageBreak/>
               <w:t>RF-BO-</w:t>
             </w:r>
           </w:p>
@@ -5507,6 +5549,7 @@
               <w:rPr>
                 <w:lang w:val="pt-PT"/>
               </w:rPr>
+              <w:lastRenderedPageBreak/>
               <w:t>Que estou no formulário de doação</w:t>
             </w:r>
           </w:p>
@@ -5525,7 +5568,6 @@
               <w:rPr>
                 <w:lang w:val="pt-PT"/>
               </w:rPr>
-              <w:lastRenderedPageBreak/>
               <w:t>Devo inserir um valor</w:t>
             </w:r>
           </w:p>
@@ -6121,13 +6163,7 @@
               <w:rPr>
                 <w:lang w:val="pt-PT"/>
               </w:rPr>
-              <w:t xml:space="preserve">Que estou </w:t>
-            </w:r>
-            <w:r>
-              <w:rPr>
-                <w:lang w:val="pt-PT"/>
-              </w:rPr>
-              <w:t>no formulário de parceria</w:t>
+              <w:t>Que estou no formulário de parceria</w:t>
             </w:r>
           </w:p>
           <w:p>
@@ -6145,13 +6181,7 @@
               <w:rPr>
                 <w:lang w:val="pt-PT"/>
               </w:rPr>
-              <w:t xml:space="preserve">Devo preencher os dados e </w:t>
-            </w:r>
-            <w:r>
-              <w:rPr>
-                <w:lang w:val="pt-PT"/>
-              </w:rPr>
-              <w:t>enviar os dados</w:t>
+              <w:t>Devo preencher os dados e enviar os dados</w:t>
             </w:r>
           </w:p>
           <w:p>
@@ -6952,6 +6982,7 @@
               <w:rPr>
                 <w:lang w:val="pt-PT"/>
               </w:rPr>
+              <w:lastRenderedPageBreak/>
               <w:t>O</w:t>
             </w:r>
             <w:r>
@@ -6996,7 +7027,6 @@
               <w:rPr>
                 <w:lang w:val="pt-PT"/>
               </w:rPr>
-              <w:lastRenderedPageBreak/>
               <w:t>Título: US</w:t>
             </w:r>
             <w:r>
@@ -7863,7 +7893,6 @@
         <w:docPartUnique/>
       </w:docPartObj>
     </w:sdtPr>
-    <w:sdtEndPr/>
     <w:sdtContent>
       <w:p>
         <w:pPr>
@@ -7938,7 +7967,6 @@
               <w:docPartUnique/>
             </w:docPartObj>
           </w:sdtPr>
-          <w:sdtEndPr/>
           <w:sdtContent>
             <w:r>
               <w:t xml:space="preserve">                                                                          Página </w:t>
@@ -10019,6 +10047,7 @@
   <w:style w:type="character" w:default="1" w:styleId="Tipodeletrapredefinidodopargrafo">
     <w:name w:val="Default Paragraph Font"/>
     <w:uiPriority w:val="1"/>
+    <w:semiHidden/>
     <w:unhideWhenUsed/>
   </w:style>
   <w:style w:type="table" w:default="1" w:styleId="Tabelanormal">
@@ -10549,6 +10578,23 @@
 </file>
 
 <file path=customXml/item1.xml><?xml version="1.0" encoding="utf-8"?>
+<p:properties xmlns:p="http://schemas.microsoft.com/office/2006/metadata/properties" xmlns:xsi="http://www.w3.org/2001/XMLSchema-instance" xmlns:pc="http://schemas.microsoft.com/office/infopath/2007/PartnerControls">
+  <documentManagement>
+    <_activity xmlns="af3c2c5a-8f73-4e82-9faa-411e6be67b09" xsi:nil="true"/>
+  </documentManagement>
+</p:properties>
+</file>
+
+<file path=customXml/item2.xml><?xml version="1.0" encoding="utf-8"?>
+<?mso-contentType ?>
+<FormTemplates xmlns="http://schemas.microsoft.com/sharepoint/v3/contenttype/forms">
+  <Display>DocumentLibraryForm</Display>
+  <Edit>DocumentLibraryForm</Edit>
+  <New>DocumentLibraryForm</New>
+</FormTemplates>
+</file>
+
+<file path=customXml/item3.xml><?xml version="1.0" encoding="utf-8"?>
 <ct:contentTypeSchema xmlns:ct="http://schemas.microsoft.com/office/2006/metadata/contentType" xmlns:ma="http://schemas.microsoft.com/office/2006/metadata/properties/metaAttributes" ct:_="" ma:_="" ma:contentTypeName="Document" ma:contentTypeID="0x01010032A8B0429CDB8147A7BA867845220449" ma:contentTypeVersion="7" ma:contentTypeDescription="Create a new document." ma:contentTypeScope="" ma:versionID="a876bfe5030167973e3d3ca2258bbeae">
   <xsd:schema xmlns:xsd="http://www.w3.org/2001/XMLSchema" xmlns:xs="http://www.w3.org/2001/XMLSchema" xmlns:p="http://schemas.microsoft.com/office/2006/metadata/properties" xmlns:ns3="af3c2c5a-8f73-4e82-9faa-411e6be67b09" targetNamespace="http://schemas.microsoft.com/office/2006/metadata/properties" ma:root="true" ma:fieldsID="f3fdd64592b9bbb8c7bfa2ada11a9d1c" ns3:_="">
     <xsd:import namespace="af3c2c5a-8f73-4e82-9faa-411e6be67b09"/>
@@ -10710,24 +10756,25 @@
 </ct:contentTypeSchema>
 </file>
 
-<file path=customXml/item2.xml><?xml version="1.0" encoding="utf-8"?>
-<?mso-contentType ?>
-<FormTemplates xmlns="http://schemas.microsoft.com/sharepoint/v3/contenttype/forms">
-  <Display>DocumentLibraryForm</Display>
-  <Edit>DocumentLibraryForm</Edit>
-  <New>DocumentLibraryForm</New>
-</FormTemplates>
+<file path=customXml/itemProps1.xml><?xml version="1.0" encoding="utf-8"?>
+<ds:datastoreItem xmlns:ds="http://schemas.openxmlformats.org/officeDocument/2006/customXml" ds:itemID="{74FCAD01-B694-4690-A122-F4995BD5D9E7}">
+  <ds:schemaRefs>
+    <ds:schemaRef ds:uri="http://schemas.microsoft.com/office/2006/metadata/properties"/>
+    <ds:schemaRef ds:uri="http://schemas.microsoft.com/office/infopath/2007/PartnerControls"/>
+    <ds:schemaRef ds:uri="af3c2c5a-8f73-4e82-9faa-411e6be67b09"/>
+  </ds:schemaRefs>
+</ds:datastoreItem>
 </file>
 
-<file path=customXml/item3.xml><?xml version="1.0" encoding="utf-8"?>
-<p:properties xmlns:p="http://schemas.microsoft.com/office/2006/metadata/properties" xmlns:xsi="http://www.w3.org/2001/XMLSchema-instance" xmlns:pc="http://schemas.microsoft.com/office/infopath/2007/PartnerControls">
-  <documentManagement>
-    <_activity xmlns="af3c2c5a-8f73-4e82-9faa-411e6be67b09" xsi:nil="true"/>
-  </documentManagement>
-</p:properties>
+<file path=customXml/itemProps2.xml><?xml version="1.0" encoding="utf-8"?>
+<ds:datastoreItem xmlns:ds="http://schemas.openxmlformats.org/officeDocument/2006/customXml" ds:itemID="{C8227C71-3C3B-4BFC-A238-A8FF9251108D}">
+  <ds:schemaRefs>
+    <ds:schemaRef ds:uri="http://schemas.microsoft.com/sharepoint/v3/contenttype/forms"/>
+  </ds:schemaRefs>
+</ds:datastoreItem>
 </file>
 
-<file path=customXml/itemProps1.xml><?xml version="1.0" encoding="utf-8"?>
+<file path=customXml/itemProps3.xml><?xml version="1.0" encoding="utf-8"?>
 <ds:datastoreItem xmlns:ds="http://schemas.openxmlformats.org/officeDocument/2006/customXml" ds:itemID="{E836E824-ADD9-420D-97D8-106ECB1D12A4}">
   <ds:schemaRefs>
     <ds:schemaRef ds:uri="http://schemas.microsoft.com/office/2006/metadata/contentType"/>
@@ -10743,22 +10790,4 @@
     <ds:schemaRef ds:uri="http://schemas.microsoft.com/internal/obd"/>
   </ds:schemaRefs>
 </ds:datastoreItem>
-</file>
-
-<file path=customXml/itemProps2.xml><?xml version="1.0" encoding="utf-8"?>
-<ds:datastoreItem xmlns:ds="http://schemas.openxmlformats.org/officeDocument/2006/customXml" ds:itemID="{C8227C71-3C3B-4BFC-A238-A8FF9251108D}">
-  <ds:schemaRefs>
-    <ds:schemaRef ds:uri="http://schemas.microsoft.com/sharepoint/v3/contenttype/forms"/>
-  </ds:schemaRefs>
-</ds:datastoreItem>
-</file>
-
-<file path=customXml/itemProps3.xml><?xml version="1.0" encoding="utf-8"?>
-<ds:datastoreItem xmlns:ds="http://schemas.openxmlformats.org/officeDocument/2006/customXml" ds:itemID="{74FCAD01-B694-4690-A122-F4995BD5D9E7}">
-  <ds:schemaRefs>
-    <ds:schemaRef ds:uri="http://schemas.microsoft.com/office/2006/metadata/properties"/>
-    <ds:schemaRef ds:uri="http://schemas.microsoft.com/office/infopath/2007/PartnerControls"/>
-    <ds:schemaRef ds:uri="af3c2c5a-8f73-4e82-9faa-411e6be67b09"/>
-  </ds:schemaRefs>
-</ds:datastoreItem>
 </file>
</xml_diff>